<commit_message>
docs: alinear alcance web y retirar foro de planificación
Actualiza informe, visión y backlog, requisitos, historias, Gantt y arquitectura. Incorpora HU18/RF-28 educativa como planificada con detalle y estimación pendientes; distingue avisos internos y decisiones pendientes. Actualiza índices de documentación.
</commit_message>
<xml_diff>
--- a/Fase 2/Evidencias Proyecto/Evidencias de documentación/Pethub_Arquitectura.docx
+++ b/Fase 2/Evidencias Proyecto/Evidencias de documentación/Pethub_Arquitectura.docx
@@ -55,38 +55,35 @@
         <w:jc w:val="center"/>
       </w:pPr>
       <w:r>
+        <w:drawing/>
+      </w:r>
+      <w:r>
         <w:drawing>
-          <wp:inline distT="0" distB="0" distL="0" distR="0">
-            <wp:extent cx="8382000" cy="4476750"/>
-            <wp:effectExtent t="0" r="0" b="0" l="0"/>
-            <wp:docPr id="1" name="arq" descr="App móvil, API REST con Socket.io, PostgreSQL, Firebase Cloud Messaging y almacenamiento de archivos" title="Arquitectura de Pethub"/>
+          <wp:inline xmlns:a="http://schemas.openxmlformats.org/drawingml/2006/main" xmlns:pic="http://schemas.openxmlformats.org/drawingml/2006/picture">
+            <wp:extent cx="5760720" cy="3840480"/>
+            <wp:docPr id="1" name="Picture 1"/>
             <wp:cNvGraphicFramePr>
-              <a:graphicFrameLocks xmlns:a="http://schemas.openxmlformats.org/drawingml/2006/main" noChangeAspect="1"/>
+              <a:graphicFrameLocks noChangeAspect="1"/>
             </wp:cNvGraphicFramePr>
-            <a:graphic xmlns:a="http://schemas.openxmlformats.org/drawingml/2006/main">
+            <a:graphic>
               <a:graphicData uri="http://schemas.openxmlformats.org/drawingml/2006/picture">
-                <pic:pic xmlns:pic="http://schemas.openxmlformats.org/drawingml/2006/picture">
+                <pic:pic>
                   <pic:nvPicPr>
-                    <pic:cNvPr id="0" name="" descr=""/>
-                    <pic:cNvPicPr>
-                      <a:picLocks noChangeAspect="1" noChangeArrowheads="1"/>
-                    </pic:cNvPicPr>
+                    <pic:cNvPr id="0" name="arquitectura-web.png"/>
+                    <pic:cNvPicPr/>
                   </pic:nvPicPr>
                   <pic:blipFill>
-                    <a:blip r:embed="rId9" cstate="none"/>
-                    <a:srcRect/>
+                    <a:blip r:embed="rId11"/>
                     <a:stretch>
                       <a:fillRect/>
                     </a:stretch>
                   </pic:blipFill>
-                  <pic:spPr bwMode="auto">
+                  <pic:spPr>
                     <a:xfrm>
                       <a:off x="0" y="0"/>
-                      <a:ext cx="8382000" cy="4476750"/>
+                      <a:ext cx="5760720" cy="3840480"/>
                     </a:xfrm>
-                    <a:prstGeom prst="rect">
-                      <a:avLst/>
-                    </a:prstGeom>
+                    <a:prstGeom prst="rect"/>
                   </pic:spPr>
                 </pic:pic>
               </a:graphicData>
@@ -105,7 +102,7 @@
           <w:sz w:val="19"/>
           <w:szCs w:val="19"/>
         </w:rPr>
-        <w:t xml:space="preserve">Pethub sigue una arquitectura cliente-servidor en tres capas: una app móvil (presentación), una API en Node.js (lógica de negocio) y una base de datos PostgreSQL (datos). El servidor delega las notificaciones y los archivos en servicios externos.</w:t>
+        <w:t>Pethub se entrega como plataforma web con arquitectura cliente-servidor en tres capas: interfaz Angular e Ionic en el navegador, API REST Node.js y Express, y PostgreSQL mediante Prisma. Los avisos actuales se consultan dentro de la plataforma y los adjuntos se almacenan en el backend.</w:t>
       </w:r>
     </w:p>
     <w:p>
@@ -297,7 +294,7 @@
                 <w:sz w:val="19"/>
                 <w:szCs w:val="19"/>
               </w:rPr>
-              <w:t xml:space="preserve">App móvil</w:t>
+              <w:t>Interfaz web</w:t>
             </w:r>
           </w:p>
         </w:tc>
@@ -327,7 +324,7 @@
                 <w:sz w:val="19"/>
                 <w:szCs w:val="19"/>
               </w:rPr>
-              <w:t xml:space="preserve">Angular + Ionic + Capacitor</w:t>
+              <w:t>Angular + Ionic</w:t>
             </w:r>
           </w:p>
         </w:tc>
@@ -357,7 +354,7 @@
                 <w:sz w:val="19"/>
                 <w:szCs w:val="19"/>
               </w:rPr>
-              <w:t xml:space="preserve">Interfaz para los dueños de mascotas; corre como app Android e iOS desde un único código web.</w:t>
+              <w:t>Pantallas y formularios en navegador; no se comprometen paquetes nativos Android/iOS.</w:t>
             </w:r>
           </w:p>
         </w:tc>
@@ -395,7 +392,7 @@
                 <w:sz w:val="19"/>
                 <w:szCs w:val="19"/>
               </w:rPr>
-              <w:t xml:space="preserve">API REST</w:t>
+              <w:t>API REST</w:t>
             </w:r>
           </w:p>
         </w:tc>
@@ -425,7 +422,7 @@
                 <w:sz w:val="19"/>
                 <w:szCs w:val="19"/>
               </w:rPr>
-              <w:t xml:space="preserve">Node.js + Express</w:t>
+              <w:t>Node.js + Express</w:t>
             </w:r>
           </w:p>
         </w:tc>
@@ -455,7 +452,7 @@
                 <w:sz w:val="19"/>
                 <w:szCs w:val="19"/>
               </w:rPr>
-              <w:t xml:space="preserve">Lógica de negocio: registro e inicio de sesión (JWT), mascotas, carnet sanitario, donantes y solicitudes.</w:t>
+              <w:t>Autenticación, mascotas, carnet sanitario, donantes, solicitudes y notificaciones internas.</w:t>
             </w:r>
           </w:p>
         </w:tc>
@@ -493,7 +490,7 @@
                 <w:sz w:val="19"/>
                 <w:szCs w:val="19"/>
               </w:rPr>
-              <w:t xml:space="preserve">Chat en tiempo real</w:t>
+              <w:t>Contacto y chat</w:t>
             </w:r>
           </w:p>
         </w:tc>
@@ -523,7 +520,7 @@
                 <w:sz w:val="19"/>
                 <w:szCs w:val="19"/>
               </w:rPr>
-              <w:t xml:space="preserve">Socket.io</w:t>
+              <w:t>Por definir</w:t>
             </w:r>
           </w:p>
         </w:tc>
@@ -553,7 +550,7 @@
                 <w:sz w:val="19"/>
                 <w:szCs w:val="19"/>
               </w:rPr>
-              <w:t xml:space="preserve">Mensajería entre quien solicita sangre y el dueño del donante, sobre una conexión WebSocket persistente. Corre en el mismo proceso que la API.</w:t>
+              <w:t>Se conserva como decisión pendiente; no se declara implementado.</w:t>
             </w:r>
           </w:p>
         </w:tc>
@@ -591,7 +588,7 @@
                 <w:sz w:val="19"/>
                 <w:szCs w:val="19"/>
               </w:rPr>
-              <w:t xml:space="preserve">Base de datos</w:t>
+              <w:t>Base de datos</w:t>
             </w:r>
           </w:p>
         </w:tc>
@@ -621,7 +618,7 @@
                 <w:sz w:val="19"/>
                 <w:szCs w:val="19"/>
               </w:rPr>
-              <w:t xml:space="preserve">PostgreSQL + Prisma</w:t>
+              <w:t>PostgreSQL + Prisma</w:t>
             </w:r>
           </w:p>
         </w:tc>
@@ -651,7 +648,7 @@
                 <w:sz w:val="19"/>
                 <w:szCs w:val="19"/>
               </w:rPr>
-              <w:t xml:space="preserve">Almacena usuarios, mascotas, carnet sanitario, donantes, solicitudes, mensajes y foro. Prisma traduce cada operación a consultas.</w:t>
+              <w:t>Usuarios, mascotas, vacunas, registros médicos, documentos, recordatorios, donantes, solicitudes y notificaciones.</w:t>
             </w:r>
           </w:p>
         </w:tc>
@@ -689,7 +686,7 @@
                 <w:sz w:val="19"/>
                 <w:szCs w:val="19"/>
               </w:rPr>
-              <w:t xml:space="preserve">Notificaciones</w:t>
+              <w:t>Notificaciones</w:t>
             </w:r>
           </w:p>
         </w:tc>
@@ -719,7 +716,7 @@
                 <w:sz w:val="19"/>
                 <w:szCs w:val="19"/>
               </w:rPr>
-              <w:t xml:space="preserve">Firebase Cloud Messaging</w:t>
+              <w:t>API REST + interfaz web</w:t>
             </w:r>
           </w:p>
         </w:tc>
@@ -749,7 +746,7 @@
                 <w:sz w:val="19"/>
                 <w:szCs w:val="19"/>
               </w:rPr>
-              <w:t xml:space="preserve">Entrega al dispositivo los avisos urgentes de donación y los recordatorios de vacunas.</w:t>
+              <w:t>Consulta de avisos, filtro de no leídas y marcado persistente. Sin compromiso de push o correo.</w:t>
             </w:r>
           </w:p>
         </w:tc>
@@ -787,7 +784,7 @@
                 <w:sz w:val="19"/>
                 <w:szCs w:val="19"/>
               </w:rPr>
-              <w:t xml:space="preserve">Archivos</w:t>
+              <w:t>Archivos</w:t>
             </w:r>
           </w:p>
         </w:tc>
@@ -817,7 +814,7 @@
                 <w:sz w:val="19"/>
                 <w:szCs w:val="19"/>
               </w:rPr>
-              <w:t xml:space="preserve">S3 compatible / Cloudflare R2</w:t>
+              <w:t>uploads del backend</w:t>
             </w:r>
           </w:p>
         </w:tc>
@@ -847,7 +844,7 @@
                 <w:sz w:val="19"/>
                 <w:szCs w:val="19"/>
               </w:rPr>
-              <w:t xml:space="preserve">Guarda las fotos y los documentos veterinarios; la base de datos conserva solo la referencia.</w:t>
+              <w:t>Adjuntos locales persistentes mediante volumen de Docker.</w:t>
             </w:r>
           </w:p>
         </w:tc>
@@ -885,7 +882,7 @@
                 <w:sz w:val="19"/>
                 <w:szCs w:val="19"/>
               </w:rPr>
-              <w:t xml:space="preserve">Despliegue</w:t>
+              <w:t>Entorno local</w:t>
             </w:r>
           </w:p>
         </w:tc>
@@ -915,7 +912,7 @@
                 <w:sz w:val="19"/>
                 <w:szCs w:val="19"/>
               </w:rPr>
-              <w:t xml:space="preserve">Docker + Docker Compose</w:t>
+              <w:t>Docker + Docker Compose</w:t>
             </w:r>
           </w:p>
         </w:tc>
@@ -945,7 +942,7 @@
                 <w:sz w:val="19"/>
                 <w:szCs w:val="19"/>
               </w:rPr>
-              <w:t xml:space="preserve">Empaqueta la API y la base de datos para levantarlas juntas con una sola configuración.</w:t>
+              <w:t>API y PostgreSQL en contenedores; frontend iniciado por separado.</w:t>
             </w:r>
           </w:p>
         </w:tc>
@@ -989,7 +986,6 @@
           <w:sz w:val="20"/>
           <w:szCs w:val="20"/>
         </w:rPr>
-        <w:t xml:space="preserve">Uso normal de la app. </w:t>
       </w:r>
       <w:r>
         <w:rPr>
@@ -997,7 +993,18 @@
           <w:sz w:val="20"/>
           <w:szCs w:val="20"/>
         </w:rPr>
-        <w:t xml:space="preserve">La app envía peticiones HTTPS a la API REST (crear cuenta, registrar mascotas, publicar solicitudes). La API valida el token JWT y responde en formato JSON.</w:t>
+      </w:r>
+      <w:r>
+        <w:rPr>
+          <w:b/>
+        </w:rPr>
+        <w:t xml:space="preserve">Uso de la web. </w:t>
+      </w:r>
+      <w:r>
+        <w:rPr>
+          <w:b w:val="0"/>
+        </w:rPr>
+        <w:t>El navegador envía peticiones HTTP a la API REST en el entorno local; la API valida el token JWT cuando corresponde y responde en JSON. El despliegue público deberá configurar HTTPS.</w:t>
       </w:r>
     </w:p>
     <w:p>
@@ -1017,7 +1024,6 @@
           <w:sz w:val="20"/>
           <w:szCs w:val="20"/>
         </w:rPr>
-        <w:t xml:space="preserve">Datos. </w:t>
       </w:r>
       <w:r>
         <w:rPr>
@@ -1025,7 +1031,18 @@
           <w:sz w:val="20"/>
           <w:szCs w:val="20"/>
         </w:rPr>
-        <w:t xml:space="preserve">Cada operación de la API se guarda o consulta en PostgreSQL a través de Prisma.</w:t>
+      </w:r>
+      <w:r>
+        <w:rPr>
+          <w:b/>
+        </w:rPr>
+        <w:t xml:space="preserve">Datos. </w:t>
+      </w:r>
+      <w:r>
+        <w:rPr>
+          <w:b w:val="0"/>
+        </w:rPr>
+        <w:t>La API consulta y modifica PostgreSQL mediante Prisma. Las migraciones se versionan en GitHub.</w:t>
       </w:r>
     </w:p>
     <w:p>
@@ -1045,7 +1062,6 @@
           <w:sz w:val="20"/>
           <w:szCs w:val="20"/>
         </w:rPr>
-        <w:t xml:space="preserve">Chat. </w:t>
       </w:r>
       <w:r>
         <w:rPr>
@@ -1053,7 +1069,18 @@
           <w:sz w:val="20"/>
           <w:szCs w:val="20"/>
         </w:rPr>
-        <w:t xml:space="preserve">La app abre una conexión WebSocket con Socket.io, que se mantiene mientras dura la conversación.</w:t>
+      </w:r>
+      <w:r>
+        <w:rPr>
+          <w:b/>
+        </w:rPr>
+        <w:t xml:space="preserve">Contacto y chat. </w:t>
+      </w:r>
+      <w:r>
+        <w:rPr>
+          <w:b w:val="0"/>
+        </w:rPr>
+        <w:t>El alcance del contacto directo y del chat sigue por definir. Socket.io no se presenta como componente implementado ni como compromiso confirmado de esta entrega.</w:t>
       </w:r>
     </w:p>
     <w:p>
@@ -1073,7 +1100,6 @@
           <w:sz w:val="20"/>
           <w:szCs w:val="20"/>
         </w:rPr>
-        <w:t xml:space="preserve">Avisos. </w:t>
       </w:r>
       <w:r>
         <w:rPr>
@@ -1081,7 +1107,18 @@
           <w:sz w:val="20"/>
           <w:szCs w:val="20"/>
         </w:rPr>
-        <w:t xml:space="preserve">Cuando hay una solicitud urgente o una vacuna por vencer, la API le pide a Firebase Cloud Messaging que envíe la notificación, y esta llega directo al teléfono.</w:t>
+      </w:r>
+      <w:r>
+        <w:rPr>
+          <w:b/>
+        </w:rPr>
+        <w:t xml:space="preserve">Avisos. </w:t>
+      </w:r>
+      <w:r>
+        <w:rPr>
+          <w:b w:val="0"/>
+        </w:rPr>
+        <w:t>Las solicitudes coincidentes generan notificaciones internas que el usuario consulta, filtra y marca como leídas. Los recordatorios de vacunas se consultan en la web. Push con FCM y correo no forman parte del comportamiento confirmado.</w:t>
       </w:r>
     </w:p>
     <w:p>
@@ -1101,7 +1138,6 @@
           <w:sz w:val="20"/>
           <w:szCs w:val="20"/>
         </w:rPr>
-        <w:t xml:space="preserve">Archivos. </w:t>
       </w:r>
       <w:r>
         <w:rPr>
@@ -1109,7 +1145,18 @@
           <w:sz w:val="20"/>
           <w:szCs w:val="20"/>
         </w:rPr>
-        <w:t xml:space="preserve">La API sube las fotos y documentos al almacenamiento externo y guarda solo su referencia en la base de datos.</w:t>
+      </w:r>
+      <w:r>
+        <w:rPr>
+          <w:b/>
+        </w:rPr>
+        <w:t xml:space="preserve">Archivos. </w:t>
+      </w:r>
+      <w:r>
+        <w:rPr>
+          <w:b w:val="0"/>
+        </w:rPr>
+        <w:t>El backend almacena los adjuntos en uploads y conserva sus referencias en PostgreSQL. Docker monta la carpeta en /app/uploads. No se presenta S3 o Cloudflare R2 como servicio implementado.</w:t>
       </w:r>
     </w:p>
     <w:p>
@@ -1124,7 +1171,6 @@
           <w:sz w:val="18"/>
           <w:szCs w:val="18"/>
         </w:rPr>
-        <w:t xml:space="preserve">Alcance: </w:t>
       </w:r>
       <w:r>
         <w:rPr>
@@ -1132,7 +1178,28 @@
           <w:sz w:val="18"/>
           <w:szCs w:val="18"/>
         </w:rPr>
-        <w:t xml:space="preserve">la aplicación facilita el contacto entre las partes; la evaluación médica y la aptitud del donante siempre corresponden al veterinario tratante.</w:t>
+      </w:r>
+      <w:r>
+        <w:rPr>
+          <w:b/>
+        </w:rPr>
+        <w:t xml:space="preserve">Alcance vigente. </w:t>
+      </w:r>
+      <w:r>
+        <w:rPr>
+          <w:b w:val="0"/>
+        </w:rPr>
+        <w:t>Se mantienen el carnet sanitario, las solicitudes y la búsqueda de donantes. El foro se retira y se reemplaza por una sección educativa todavía no implementada, con contenidos y criterios detallados por validar. El chat y los módulos nuevos de la práctica permanecen por definir. La aptitud médica del donante siempre corresponde a un veterinario.</w:t>
+      </w:r>
+    </w:p>
+    <w:p>
+      <w:r>
+        <w:rPr>
+          <w:rFonts w:ascii="Calibri" w:hAnsi="Calibri"/>
+          <w:b w:val="0"/>
+          <w:sz w:val="22"/>
+        </w:rPr>
+        <w:t>Actualización de alcance: 27-10-2026. La sección educativa reemplaza al foro; su detalle funcional requiere validación antes de comprometer esfuerzo o fecha.</w:t>
       </w:r>
     </w:p>
     <w:sectPr>

</xml_diff>